<commit_message>
Added images and updated general design
</commit_message>
<xml_diff>
--- a/Design/MeepleWood_Software Architecture.docx
+++ b/Design/MeepleWood_Software Architecture.docx
@@ -159,7 +159,7 @@
                                         <w:szCs w:val="72"/>
                                         <w:lang w:val="en-GB"/>
                                       </w:rPr>
-                                      <w:t>Design</w:t>
+                                      <w:t>Software Architecture</w:t>
                                     </w:r>
                                   </w:sdtContent>
                                 </w:sdt>
@@ -170,7 +170,7 @@
                                     <w:szCs w:val="72"/>
                                     <w:lang w:val="en-GB"/>
                                   </w:rPr>
-                                  <w:t xml:space="preserve"> Document</w:t>
+                                  <w:t xml:space="preserve"> </w:t>
                                 </w:r>
                               </w:p>
                             </w:txbxContent>
@@ -233,7 +233,7 @@
                                   <w:szCs w:val="72"/>
                                   <w:lang w:val="en-GB"/>
                                 </w:rPr>
-                                <w:t>Design</w:t>
+                                <w:t>Software Architecture</w:t>
                               </w:r>
                             </w:sdtContent>
                           </w:sdt>
@@ -244,7 +244,7 @@
                               <w:szCs w:val="72"/>
                               <w:lang w:val="en-GB"/>
                             </w:rPr>
-                            <w:t xml:space="preserve"> Document</w:t>
+                            <w:t xml:space="preserve"> </w:t>
                           </w:r>
                         </w:p>
                       </w:txbxContent>
@@ -1481,21 +1481,7 @@
         <w:noProof/>
         <w:color w:val="002060"/>
       </w:rPr>
-      <w:t>0</w:t>
-    </w:r>
-    <w:r>
-      <w:rPr>
-        <w:noProof/>
-        <w:color w:val="002060"/>
-      </w:rPr>
-      <w:t>5</w:t>
-    </w:r>
-    <w:r>
-      <w:rPr>
-        <w:noProof/>
-        <w:color w:val="002060"/>
-      </w:rPr>
-      <w:t>/04/2026</w:t>
+      <w:t>05/04/2026</w:t>
     </w:r>
     <w:r>
       <w:rPr>
@@ -1515,7 +1501,14 @@
       <w:rPr>
         <w:color w:val="002060"/>
       </w:rPr>
-      <w:t>Gir Repro</w:t>
+      <w:t xml:space="preserve">Gir </w:t>
+    </w:r>
+    <w:proofErr w:type="spellStart"/>
+    <w:r>
+      <w:rPr>
+        <w:color w:val="002060"/>
+      </w:rPr>
+      <w:t>Repro</w:t>
     </w:r>
     <w:r>
       <w:rPr>
@@ -1523,6 +1516,7 @@
       </w:rPr>
       <w:t>sitory</w:t>
     </w:r>
+    <w:proofErr w:type="spellEnd"/>
     <w:r>
       <w:rPr>
         <w:color w:val="002060"/>

</xml_diff>